<commit_message>
Report: add Gaurav Lad (61) to team
Cover, approval, and declaration now list three members.
</commit_message>
<xml_diff>
--- a/report/Blockchain_Mini_Project_Report.docx
+++ b/report/Blockchain_Mini_Project_Report.docx
@@ -134,6 +134,22 @@
           <w:sz w:val="26"/>
         </w:rPr>
         <w:t>Rugved Khandake (60)</w:t>
+      </w:r>
+    </w:p>
+    <w:p>
+      <w:pPr>
+        <w:spacing w:before="0" w:after="40" w:line="276" w:lineRule="auto"/>
+        <w:jc w:val="center"/>
+      </w:pPr>
+      <w:r>
+        <w:rPr>
+          <w:rFonts w:ascii="Liberation Serif" w:hAnsi="Liberation Serif" w:eastAsia="Liberation Serif"/>
+          <w:b/>
+          <w:i w:val="0"/>
+          <w:color w:val="000000"/>
+          <w:sz w:val="26"/>
+        </w:rPr>
+        <w:t>Gaurav Lad (61)</w:t>
       </w:r>
     </w:p>
     <w:p>
@@ -338,7 +354,7 @@
           <w:color w:val="000000"/>
           <w:sz w:val="24"/>
         </w:rPr>
-        <w:t>Ms. Riya Jha (47) and Mr. Rugved Khandake (60)</w:t>
+        <w:t>Ms. Riya Jha (47), Mr. Rugved Khandake (60) and Mr. Gaurav Lad (61)</w:t>
       </w:r>
       <w:r>
         <w:rPr>
@@ -554,6 +570,54 @@
           <w:sz w:val="24"/>
         </w:rPr>
         <w:t>Mr. Rugved Khandake (60)</w:t>
+      </w:r>
+    </w:p>
+    <w:p>
+      <w:pPr>
+        <w:spacing w:before="360" w:after="0" w:line="240" w:lineRule="auto"/>
+        <w:jc w:val="right"/>
+      </w:pPr>
+      <w:r>
+        <w:rPr>
+          <w:rFonts w:ascii="Liberation Serif" w:hAnsi="Liberation Serif" w:eastAsia="Liberation Serif"/>
+          <w:b w:val="0"/>
+          <w:i w:val="0"/>
+          <w:color w:val="000000"/>
+          <w:sz w:val="24"/>
+        </w:rPr>
+        <w:t>________________________</w:t>
+      </w:r>
+    </w:p>
+    <w:p>
+      <w:pPr>
+        <w:spacing w:before="0" w:after="0" w:line="240" w:lineRule="auto"/>
+        <w:jc w:val="right"/>
+      </w:pPr>
+      <w:r>
+        <w:rPr>
+          <w:rFonts w:ascii="Liberation Serif" w:hAnsi="Liberation Serif" w:eastAsia="Liberation Serif"/>
+          <w:b w:val="0"/>
+          <w:i w:val="0"/>
+          <w:color w:val="000000"/>
+          <w:sz w:val="22"/>
+        </w:rPr>
+        <w:t>Signature</w:t>
+      </w:r>
+    </w:p>
+    <w:p>
+      <w:pPr>
+        <w:spacing w:before="0" w:after="120" w:line="276" w:lineRule="auto"/>
+        <w:jc w:val="right"/>
+      </w:pPr>
+      <w:r>
+        <w:rPr>
+          <w:rFonts w:ascii="Liberation Serif" w:hAnsi="Liberation Serif" w:eastAsia="Liberation Serif"/>
+          <w:b/>
+          <w:i w:val="0"/>
+          <w:color w:val="000000"/>
+          <w:sz w:val="24"/>
+        </w:rPr>
+        <w:t>Mr. Gaurav Lad (61)</w:t>
       </w:r>
     </w:p>
     <w:p>

</xml_diff>